<commit_message>
chore: update nuevas funcionalidades
</commit_message>
<xml_diff>
--- a/renads-api/docs/diccionario_datos.docx
+++ b/renads-api/docs/diccionario_datos.docx
@@ -45,7 +45,7 @@
         <w:rPr>
           <w:sz w:val="20"/>
         </w:rPr>
-        <w:t>Generado el 17/07/2026</w:t>
+        <w:t>Generado el 20/07/2026</w:t>
       </w:r>
     </w:p>
     <w:p>
@@ -547,7 +547,7 @@
               <w:rPr>
                 <w:sz w:val="18"/>
               </w:rPr>
-              <w:t>valores: CARRERA_PROFESIONAL, SEGUNDA_ESPECIALIDAD, MAESTRIA, DOCTORADO</w:t>
+              <w:t>valores: PREGRADO, SEGUNDA_ESPECIALIDAD, MAESTRIA, DOCTORADO</w:t>
             </w:r>
           </w:p>
         </w:tc>
@@ -2984,6 +2984,60 @@
               <w:rPr>
                 <w:sz w:val="18"/>
               </w:rPr>
+              <w:t>referencia_logo</w:t>
+            </w:r>
+          </w:p>
+        </w:tc>
+        <w:tc>
+          <w:tcPr>
+            <w:tcW w:type="dxa" w:w="2160"/>
+          </w:tcPr>
+          <w:p>
+            <w:r>
+              <w:rPr>
+                <w:sz w:val="18"/>
+              </w:rPr>
+              <w:t>varchar(500)</w:t>
+            </w:r>
+          </w:p>
+        </w:tc>
+        <w:tc>
+          <w:tcPr>
+            <w:tcW w:type="dxa" w:w="2160"/>
+          </w:tcPr>
+          <w:p>
+            <w:r>
+              <w:rPr>
+                <w:sz w:val="18"/>
+              </w:rPr>
+              <w:t>Sí</w:t>
+            </w:r>
+          </w:p>
+        </w:tc>
+        <w:tc>
+          <w:tcPr>
+            <w:tcW w:type="dxa" w:w="2160"/>
+          </w:tcPr>
+          <w:p>
+            <w:r>
+              <w:rPr>
+                <w:sz w:val="18"/>
+              </w:rPr>
+              <w:t>Referencia externa del logo (repositorio externo)</w:t>
+            </w:r>
+          </w:p>
+        </w:tc>
+      </w:tr>
+      <w:tr>
+        <w:tc>
+          <w:tcPr>
+            <w:tcW w:type="dxa" w:w="2160"/>
+          </w:tcPr>
+          <w:p>
+            <w:r>
+              <w:rPr>
+                <w:sz w:val="18"/>
+              </w:rPr>
               <w:t>activo</w:t>
             </w:r>
           </w:p>
@@ -5660,20 +5714,20 @@
               <w:rPr>
                 <w:sz w:val="18"/>
               </w:rPr>
-              <w:t>facultad_id</w:t>
-            </w:r>
-          </w:p>
-        </w:tc>
-        <w:tc>
-          <w:tcPr>
-            <w:tcW w:type="dxa" w:w="2160"/>
-          </w:tcPr>
-          <w:p>
-            <w:r>
-              <w:rPr>
-                <w:sz w:val="18"/>
-              </w:rPr>
-              <w:t>FK → facultad</w:t>
+              <w:t>nombre</w:t>
+            </w:r>
+          </w:p>
+        </w:tc>
+        <w:tc>
+          <w:tcPr>
+            <w:tcW w:type="dxa" w:w="2160"/>
+          </w:tcPr>
+          <w:p>
+            <w:r>
+              <w:rPr>
+                <w:sz w:val="18"/>
+              </w:rPr>
+              <w:t>varchar(255)</w:t>
             </w:r>
           </w:p>
         </w:tc>
@@ -5699,7 +5753,7 @@
               <w:rPr>
                 <w:sz w:val="18"/>
               </w:rPr>
-              <w:t>Facultad</w:t>
+              <w:t>Nombre de la carrera o programa</w:t>
             </w:r>
           </w:p>
         </w:tc>
@@ -5714,20 +5768,20 @@
               <w:rPr>
                 <w:sz w:val="18"/>
               </w:rPr>
-              <w:t>nombre</w:t>
-            </w:r>
-          </w:p>
-        </w:tc>
-        <w:tc>
-          <w:tcPr>
-            <w:tcW w:type="dxa" w:w="2160"/>
-          </w:tcPr>
-          <w:p>
-            <w:r>
-              <w:rPr>
-                <w:sz w:val="18"/>
-              </w:rPr>
-              <w:t>varchar(255)</w:t>
+              <w:t>nivel_academico_id</w:t>
+            </w:r>
+          </w:p>
+        </w:tc>
+        <w:tc>
+          <w:tcPr>
+            <w:tcW w:type="dxa" w:w="2160"/>
+          </w:tcPr>
+          <w:p>
+            <w:r>
+              <w:rPr>
+                <w:sz w:val="18"/>
+              </w:rPr>
+              <w:t>FK → nivel_academico</w:t>
             </w:r>
           </w:p>
         </w:tc>
@@ -5753,115 +5807,7 @@
               <w:rPr>
                 <w:sz w:val="18"/>
               </w:rPr>
-              <w:t>Nombre de la carrera o programa</w:t>
-            </w:r>
-          </w:p>
-        </w:tc>
-      </w:tr>
-      <w:tr>
-        <w:tc>
-          <w:tcPr>
-            <w:tcW w:type="dxa" w:w="2160"/>
-          </w:tcPr>
-          <w:p>
-            <w:r>
-              <w:rPr>
-                <w:sz w:val="18"/>
-              </w:rPr>
-              <w:t>nivel_academico_id</w:t>
-            </w:r>
-          </w:p>
-        </w:tc>
-        <w:tc>
-          <w:tcPr>
-            <w:tcW w:type="dxa" w:w="2160"/>
-          </w:tcPr>
-          <w:p>
-            <w:r>
-              <w:rPr>
-                <w:sz w:val="18"/>
-              </w:rPr>
-              <w:t>FK → nivel_academico</w:t>
-            </w:r>
-          </w:p>
-        </w:tc>
-        <w:tc>
-          <w:tcPr>
-            <w:tcW w:type="dxa" w:w="2160"/>
-          </w:tcPr>
-          <w:p>
-            <w:r>
-              <w:rPr>
-                <w:sz w:val="18"/>
-              </w:rPr>
-              <w:t>No</w:t>
-            </w:r>
-          </w:p>
-        </w:tc>
-        <w:tc>
-          <w:tcPr>
-            <w:tcW w:type="dxa" w:w="2160"/>
-          </w:tcPr>
-          <w:p>
-            <w:r>
-              <w:rPr>
-                <w:sz w:val="18"/>
-              </w:rPr>
               <w:t>Carrera profesional / segunda especialidad / maestría / doctorado</w:t>
-            </w:r>
-          </w:p>
-        </w:tc>
-      </w:tr>
-      <w:tr>
-        <w:tc>
-          <w:tcPr>
-            <w:tcW w:type="dxa" w:w="2160"/>
-          </w:tcPr>
-          <w:p>
-            <w:r>
-              <w:rPr>
-                <w:sz w:val="18"/>
-              </w:rPr>
-              <w:t>especialidad_id</w:t>
-            </w:r>
-          </w:p>
-        </w:tc>
-        <w:tc>
-          <w:tcPr>
-            <w:tcW w:type="dxa" w:w="2160"/>
-          </w:tcPr>
-          <w:p>
-            <w:r>
-              <w:rPr>
-                <w:sz w:val="18"/>
-              </w:rPr>
-              <w:t>FK → especialidad</w:t>
-            </w:r>
-          </w:p>
-        </w:tc>
-        <w:tc>
-          <w:tcPr>
-            <w:tcW w:type="dxa" w:w="2160"/>
-          </w:tcPr>
-          <w:p>
-            <w:r>
-              <w:rPr>
-                <w:sz w:val="18"/>
-              </w:rPr>
-              <w:t>Sí</w:t>
-            </w:r>
-          </w:p>
-        </w:tc>
-        <w:tc>
-          <w:tcPr>
-            <w:tcW w:type="dxa" w:w="2160"/>
-          </w:tcPr>
-          <w:p>
-            <w:r>
-              <w:rPr>
-                <w:sz w:val="18"/>
-              </w:rPr>
-              <w:t>Especialidad asociada</w:t>
             </w:r>
           </w:p>
         </w:tc>
@@ -13661,6 +13607,60 @@
                 <w:sz w:val="18"/>
               </w:rPr>
               <w:t>Versión previa reemplazada (RNF-DOC-04 / AUD-04)</w:t>
+            </w:r>
+          </w:p>
+        </w:tc>
+      </w:tr>
+      <w:tr>
+        <w:tc>
+          <w:tcPr>
+            <w:tcW w:type="dxa" w:w="2160"/>
+          </w:tcPr>
+          <w:p>
+            <w:r>
+              <w:rPr>
+                <w:sz w:val="18"/>
+              </w:rPr>
+              <w:t>documento_anexo_id</w:t>
+            </w:r>
+          </w:p>
+        </w:tc>
+        <w:tc>
+          <w:tcPr>
+            <w:tcW w:type="dxa" w:w="2160"/>
+          </w:tcPr>
+          <w:p>
+            <w:r>
+              <w:rPr>
+                <w:sz w:val="18"/>
+              </w:rPr>
+              <w:t>FK → documentos_anexos (módulo 2)</w:t>
+            </w:r>
+          </w:p>
+        </w:tc>
+        <w:tc>
+          <w:tcPr>
+            <w:tcW w:type="dxa" w:w="2160"/>
+          </w:tcPr>
+          <w:p>
+            <w:r>
+              <w:rPr>
+                <w:sz w:val="18"/>
+              </w:rPr>
+              <w:t>Sí</w:t>
+            </w:r>
+          </w:p>
+        </w:tc>
+        <w:tc>
+          <w:tcPr>
+            <w:tcW w:type="dxa" w:w="2160"/>
+          </w:tcPr>
+          <w:p>
+            <w:r>
+              <w:rPr>
+                <w:sz w:val="18"/>
+              </w:rPr>
+              <w:t>Anexo (declaración jurada) al que corresponde el documento; nulo para documentos que no son anexos. Cuando se define, el versionado se discrimina por (objeto, documento_anexo) en lugar de por tipo_documento</w:t>
             </w:r>
           </w:p>
         </w:tc>
@@ -14443,7 +14443,9 @@
         <w:br/>
         <w:t>universidad ──&lt; autoridad_universidad</w:t>
         <w:br/>
-        <w:t>universidad ──&lt; facultad ──&lt; carrera_profesional &gt;── nivel_academico / especialidad</w:t>
+        <w:t>universidad ──&lt; facultad</w:t>
+        <w:br/>
+        <w:t>carrera_profesional &gt;── nivel_academico</w:t>
         <w:br/>
         <w:t>universidad ──&lt; local_universidad &gt;── region</w:t>
         <w:br/>
@@ -14480,7 +14482,9 @@
         <w:t>convenio ──&lt; publicacion</w:t>
         <w:br/>
         <w:br/>
-        <w:t>documento          &gt;── django_content_type   (genérico → cualquier tabla del flujo)</w:t>
+        <w:t>documento          &gt;── django_content_type   (genérico → cualquier tabla del flujo / anexos por actor)</w:t>
+        <w:br/>
+        <w:t>documento          &gt;── documentos_anexos      (módulo 2; nulo salvo anexos por actor)</w:t>
         <w:br/>
         <w:t>bitacora_auditoria &gt;── django_content_type   (genérico → cualquier entidad)</w:t>
       </w:r>
@@ -14769,6 +14773,88 @@
                 <w:sz w:val="18"/>
               </w:rPr>
               <w:t>—</w:t>
+            </w:r>
+          </w:p>
+        </w:tc>
+      </w:tr>
+      <w:tr>
+        <w:tc>
+          <w:tcPr>
+            <w:tcW w:type="dxa" w:w="2880"/>
+          </w:tcPr>
+          <w:p>
+            <w:r>
+              <w:rPr>
+                <w:sz w:val="18"/>
+              </w:rPr>
+              <w:t>periodo_academico</w:t>
+            </w:r>
+          </w:p>
+        </w:tc>
+        <w:tc>
+          <w:tcPr>
+            <w:tcW w:type="dxa" w:w="2880"/>
+          </w:tcPr>
+          <w:p>
+            <w:r>
+              <w:rPr>
+                <w:sz w:val="18"/>
+              </w:rPr>
+              <w:t>Periodo académico (semestre) del estudiante — aplica al nivel Pregrado (RN-19)</w:t>
+            </w:r>
+          </w:p>
+        </w:tc>
+        <w:tc>
+          <w:tcPr>
+            <w:tcW w:type="dxa" w:w="2880"/>
+          </w:tcPr>
+          <w:p>
+            <w:r>
+              <w:rPr>
+                <w:sz w:val="18"/>
+              </w:rPr>
+              <w:t>—</w:t>
+            </w:r>
+          </w:p>
+        </w:tc>
+      </w:tr>
+      <w:tr>
+        <w:tc>
+          <w:tcPr>
+            <w:tcW w:type="dxa" w:w="2880"/>
+          </w:tcPr>
+          <w:p>
+            <w:r>
+              <w:rPr>
+                <w:sz w:val="18"/>
+              </w:rPr>
+              <w:t>documentos_anexos</w:t>
+            </w:r>
+          </w:p>
+        </w:tc>
+        <w:tc>
+          <w:tcPr>
+            <w:tcW w:type="dxa" w:w="2880"/>
+          </w:tcPr>
+          <w:p>
+            <w:r>
+              <w:rPr>
+                <w:sz w:val="18"/>
+              </w:rPr>
+              <w:t>Catálogo maestro de documentos requeridos **por actor** (declaraciones juradas, resolución del cargo, documento de identidad) a adjuntar tras el registro</w:t>
+            </w:r>
+          </w:p>
+        </w:tc>
+        <w:tc>
+          <w:tcPr>
+            <w:tcW w:type="dxa" w:w="2880"/>
+          </w:tcPr>
+          <w:p>
+            <w:r>
+              <w:rPr>
+                <w:sz w:val="18"/>
+              </w:rPr>
+              <w:t>tipo_actor (choices: INTERNO / AUTORIDAD_UNIVERSIDAD / REPRESENTANTE, default INTERNO), descripcion (text), obligatorio (bool, default True)</w:t>
             </w:r>
           </w:p>
         </w:tc>
@@ -14834,6 +14920,40 @@
         <w:t>`PADRE`, `MADRE`, `HERMANO`, `CONYUGE`, `HIJO`, `ABUELO`, `TIO`, `OTRO`.</w:t>
       </w:r>
     </w:p>
+    <w:p>
+      <w:r>
+        <w:rPr>
+          <w:b/>
+          <w:sz w:val="20"/>
+        </w:rPr>
+        <w:t>Valores de periodo_academico (semilla)</w:t>
+      </w:r>
+    </w:p>
+    <w:p>
+      <w:r>
+        <w:rPr>
+          <w:sz w:val="18"/>
+        </w:rPr>
+        <w:t>`2025-I`, `2025-II`, `2026-I`, `2026-II` (nombre `Semestre &lt;codigo&gt;`).</w:t>
+      </w:r>
+    </w:p>
+    <w:p>
+      <w:r>
+        <w:rPr>
+          <w:b/>
+          <w:sz w:val="20"/>
+        </w:rPr>
+        <w:t>Valores de documentos_anexos (semilla)</w:t>
+      </w:r>
+    </w:p>
+    <w:p>
+      <w:r>
+        <w:rPr>
+          <w:sz w:val="18"/>
+        </w:rPr>
+        <w:t>**`tipo_actor = INTERNO`** (declaraciones juradas del estudiante): `DJ_DATOS` (Declaración jurada de veracidad de datos), `DJ_ANTECEDENTES` (Declaración jurada de no tener antecedentes penales/policiales), `DJ_SALUD` (Declaración jurada de aptitud de salud), `DJ_CONFIDENCIALIDAD` (Compromiso de confidencialidad). **`tipo_actor = AUTORIDAD_UNIVERSIDAD`**: `RESOL_AUTUNI` (Resolución de designación del cargo), `DNI_AUTUNI` (Documento de identidad). **`tipo_actor = REPRESENTANTE`** (incluye autoridades de CONAPRES): `RESOL_REP` (Resolución de designación del cargo), `DNI_REP` (Documento de identidad). Todos con `obligatorio = True`.</w:t>
+      </w:r>
+    </w:p>
     <w:p/>
     <w:p>
       <w:pPr>
@@ -15680,6 +15800,114 @@
                 <w:sz w:val="18"/>
               </w:rPr>
               <w:t>Carrera / programa</w:t>
+            </w:r>
+          </w:p>
+        </w:tc>
+      </w:tr>
+      <w:tr>
+        <w:tc>
+          <w:tcPr>
+            <w:tcW w:type="dxa" w:w="2160"/>
+          </w:tcPr>
+          <w:p>
+            <w:r>
+              <w:rPr>
+                <w:sz w:val="18"/>
+              </w:rPr>
+              <w:t>periodo_academico_id</w:t>
+            </w:r>
+          </w:p>
+        </w:tc>
+        <w:tc>
+          <w:tcPr>
+            <w:tcW w:type="dxa" w:w="2160"/>
+          </w:tcPr>
+          <w:p>
+            <w:r>
+              <w:rPr>
+                <w:sz w:val="18"/>
+              </w:rPr>
+              <w:t>FK → periodo_academico</w:t>
+            </w:r>
+          </w:p>
+        </w:tc>
+        <w:tc>
+          <w:tcPr>
+            <w:tcW w:type="dxa" w:w="2160"/>
+          </w:tcPr>
+          <w:p>
+            <w:r>
+              <w:rPr>
+                <w:sz w:val="18"/>
+              </w:rPr>
+              <w:t>Sí</w:t>
+            </w:r>
+          </w:p>
+        </w:tc>
+        <w:tc>
+          <w:tcPr>
+            <w:tcW w:type="dxa" w:w="2160"/>
+          </w:tcPr>
+          <w:p>
+            <w:r>
+              <w:rPr>
+                <w:sz w:val="18"/>
+              </w:rPr>
+              <w:t>Periodo académico (obligatorio para nivel PREGRADO — RN-19; PROTECT)</w:t>
+            </w:r>
+          </w:p>
+        </w:tc>
+      </w:tr>
+      <w:tr>
+        <w:tc>
+          <w:tcPr>
+            <w:tcW w:type="dxa" w:w="2160"/>
+          </w:tcPr>
+          <w:p>
+            <w:r>
+              <w:rPr>
+                <w:sz w:val="18"/>
+              </w:rPr>
+              <w:t>especialidad_id</w:t>
+            </w:r>
+          </w:p>
+        </w:tc>
+        <w:tc>
+          <w:tcPr>
+            <w:tcW w:type="dxa" w:w="2160"/>
+          </w:tcPr>
+          <w:p>
+            <w:r>
+              <w:rPr>
+                <w:sz w:val="18"/>
+              </w:rPr>
+              <w:t>FK → especialidad</w:t>
+            </w:r>
+          </w:p>
+        </w:tc>
+        <w:tc>
+          <w:tcPr>
+            <w:tcW w:type="dxa" w:w="2160"/>
+          </w:tcPr>
+          <w:p>
+            <w:r>
+              <w:rPr>
+                <w:sz w:val="18"/>
+              </w:rPr>
+              <w:t>Sí</w:t>
+            </w:r>
+          </w:p>
+        </w:tc>
+        <w:tc>
+          <w:tcPr>
+            <w:tcW w:type="dxa" w:w="2160"/>
+          </w:tcPr>
+          <w:p>
+            <w:r>
+              <w:rPr>
+                <w:sz w:val="18"/>
+              </w:rPr>
+              <w:t>Especialidad (obligatoria para niveles distintos de PREGRADO — RN-19; SET_NULL)</w:t>
             </w:r>
           </w:p>
         </w:tc>
@@ -17547,6 +17775,60 @@
               <w:rPr>
                 <w:sz w:val="18"/>
               </w:rPr>
+              <w:t>estado_declaraciones</w:t>
+            </w:r>
+          </w:p>
+        </w:tc>
+        <w:tc>
+          <w:tcPr>
+            <w:tcW w:type="dxa" w:w="2160"/>
+          </w:tcPr>
+          <w:p>
+            <w:r>
+              <w:rPr>
+                <w:sz w:val="18"/>
+              </w:rPr>
+              <w:t>varchar(20)</w:t>
+            </w:r>
+          </w:p>
+        </w:tc>
+        <w:tc>
+          <w:tcPr>
+            <w:tcW w:type="dxa" w:w="2160"/>
+          </w:tcPr>
+          <w:p>
+            <w:r>
+              <w:rPr>
+                <w:sz w:val="18"/>
+              </w:rPr>
+              <w:t>No</w:t>
+            </w:r>
+          </w:p>
+        </w:tc>
+        <w:tc>
+          <w:tcPr>
+            <w:tcW w:type="dxa" w:w="2160"/>
+          </w:tcPr>
+          <w:p>
+            <w:r>
+              <w:rPr>
+                <w:sz w:val="18"/>
+              </w:rPr>
+              <w:t>Estado de las declaraciones juradas del interno (RN-23). Valores: PENDIENTE (default), COMPLETAS, OBSERVADAS, VALIDADAS</w:t>
+            </w:r>
+          </w:p>
+        </w:tc>
+      </w:tr>
+      <w:tr>
+        <w:tc>
+          <w:tcPr>
+            <w:tcW w:type="dxa" w:w="2160"/>
+          </w:tcPr>
+          <w:p>
+            <w:r>
+              <w:rPr>
+                <w:sz w:val="18"/>
+              </w:rPr>
               <w:t>fecha_inicio</w:t>
             </w:r>
           </w:p>
@@ -20409,6 +20691,8 @@
           <w:sz w:val="16"/>
         </w:rPr>
         <w:t>estudiante &gt;── universidad / carrera_profesional / tipo_documento_identidad / parentesco (contacto_emergencia_parentesco_id)</w:t>
+        <w:br/>
+        <w:t>estudiante &gt;── periodo_academico / especialidad   (uno u otro según nivel — RN-19)</w:t>
         <w:br/>
         <w:t>tutor   &gt;── especialidad / ipress / tipo_documento_identidad</w:t>
         <w:br/>
@@ -22576,10 +22860,6 @@
         <w:br/>
         <w:t xml:space="preserve">    universidad ||--o{ local_universidad : ""</w:t>
         <w:br/>
-        <w:t xml:space="preserve">    facultad ||--o{ carrera_profesional : ""</w:t>
-        <w:br/>
-        <w:t xml:space="preserve">    especialidad ||--o{ carrera_profesional : ""</w:t>
-        <w:br/>
         <w:t xml:space="preserve">    nivel_academico ||--o{ carrera_profesional : ""</w:t>
         <w:br/>
         <w:br/>
@@ -22632,6 +22912,10 @@
         <w:br/>
         <w:t xml:space="preserve">    parentesco ||--o{ estudiante : "contacto emergencia"</w:t>
         <w:br/>
+        <w:t xml:space="preserve">    periodo_academico ||--o{ estudiante : "Pregrado (RN-19)"</w:t>
+        <w:br/>
+        <w:t xml:space="preserve">    especialidad ||--o{ estudiante : "otro nivel (RN-19)"</w:t>
+        <w:br/>
         <w:t xml:space="preserve">    interno ||--o{ historial_estado_internado : ""</w:t>
         <w:br/>
         <w:t xml:space="preserve">    interno ||--o{ historial_tutor : ""</w:t>
@@ -22647,6 +22931,16 @@
         <w:t xml:space="preserve">    participante_convenio ||--o{ autorizacion_rotacion : ""</w:t>
         <w:br/>
         <w:t xml:space="preserve">    rotacion ||--o{ historial_estado_rotacion : ""</w:t>
+        <w:br/>
+        <w:t xml:space="preserve">    %% Catálogo maestro de documentos requeridos por actor (interno / autoridad universidad /</w:t>
+        <w:br/>
+        <w:t xml:space="preserve">    %% representante-CONAPRES) vía tipo_actor; el adjunto real por entidad se guarda en `documento`</w:t>
+        <w:br/>
+        <w:t xml:space="preserve">    %% (FK documento_anexo_id, versionado por (objeto, documento_anexo)).</w:t>
+        <w:br/>
+        <w:t xml:space="preserve">    documentos_anexos {</w:t>
+        <w:br/>
+        <w:t xml:space="preserve">    }</w:t>
         <w:br/>
         <w:br/>
         <w:t xml:space="preserve">    %% ===== M3: Actividad =====</w:t>
@@ -22671,6 +22965,8 @@
         <w:br/>
         <w:br/>
         <w:t xml:space="preserve">    %% ===== Transversales (polimórficas) =====</w:t>
+        <w:br/>
+        <w:t xml:space="preserve">    documento }o--o| documentos_anexos : "anexo (nulo salvo anexos por actor)"</w:t>
         <w:br/>
         <w:t xml:space="preserve">    documento }o--|| django_content_type : "genérico"</w:t>
         <w:br/>
@@ -23083,6 +23379,8 @@
         <w:t>universidad ────────────────────&gt; estudiante</w:t>
         <w:br/>
         <w:t>carrera_profesional ────────────&gt; estudiante</w:t>
+        <w:br/>
+        <w:t xml:space="preserve">                                  estudiante &gt;── periodo_academico / especialidad (RN-19)</w:t>
         <w:br/>
         <w:t>participante_convenio ──────────&gt; autorizacion_rotacion</w:t>
         <w:br/>
@@ -23209,7 +23507,7 @@
               <w:rPr>
                 <w:sz w:val="18"/>
               </w:rPr>
-              <w:t>estado_internado, estado_rotacion, servicio_area, tipo_documento_identidad, parentesco, estudiante, tutor, interno, historial_estado_internado, historial_tutor, rotacion, autorizacion_rotacion, historial_estado_rotacion</w:t>
+              <w:t>estado_internado, estado_rotacion, servicio_area, tipo_documento_identidad, parentesco, periodo_academico, documentos_anexos, estudiante, tutor, interno, historial_estado_internado, historial_tutor, rotacion, autorizacion_rotacion, historial_estado_rotacion</w:t>
             </w:r>
           </w:p>
         </w:tc>

</xml_diff>

<commit_message>
chore: update proyecto - 3er entregable
</commit_message>
<xml_diff>
--- a/renads-api/docs/diccionario_datos.docx
+++ b/renads-api/docs/diccionario_datos.docx
@@ -45,7 +45,7 @@
         <w:rPr>
           <w:sz w:val="20"/>
         </w:rPr>
-        <w:t>Generado el 20/07/2026</w:t>
+        <w:t>Generado el 22/07/2026</w:t>
       </w:r>
     </w:p>
     <w:p>
@@ -1253,7 +1253,7 @@
               <w:rPr>
                 <w:sz w:val="18"/>
               </w:rPr>
-              <w:t>Referencia externa del logo (repositorio externo)</w:t>
+              <w:t>Logo institucional (ImageField; guarda el path del objeto en el repositorio de medios). Nullable.</w:t>
             </w:r>
           </w:p>
         </w:tc>
@@ -1825,7 +1825,7 @@
               <w:rPr>
                 <w:sz w:val="18"/>
               </w:rPr>
-              <w:t>Referencia externa del logo (repositorio externo)</w:t>
+              <w:t>Logo institucional (ImageField; guarda el path del objeto en el repositorio de medios). Nullable.</w:t>
             </w:r>
           </w:p>
         </w:tc>
@@ -2397,7 +2397,7 @@
               <w:rPr>
                 <w:sz w:val="18"/>
               </w:rPr>
-              <w:t>Referencia externa del logo (repositorio externo)</w:t>
+              <w:t>Logo institucional (ImageField; guarda el path del objeto en el repositorio de medios). Nullable.</w:t>
             </w:r>
           </w:p>
         </w:tc>
@@ -3023,7 +3023,7 @@
               <w:rPr>
                 <w:sz w:val="18"/>
               </w:rPr>
-              <w:t>Referencia externa del logo (repositorio externo)</w:t>
+              <w:t>Logo institucional (ImageField; guarda el path del objeto en el repositorio de medios). Nullable.</w:t>
             </w:r>
           </w:p>
         </w:tc>
@@ -4631,7 +4631,7 @@
               <w:rPr>
                 <w:sz w:val="18"/>
               </w:rPr>
-              <w:t>Referencia externa del logo (repositorio externo)</w:t>
+              <w:t>Logo institucional (ImageField; guarda el path del objeto en el repositorio de medios). Nullable.</w:t>
             </w:r>
           </w:p>
         </w:tc>
@@ -13445,6 +13445,60 @@
                 <w:sz w:val="18"/>
               </w:rPr>
               <w:t>Nombre del archivo</w:t>
+            </w:r>
+          </w:p>
+        </w:tc>
+      </w:tr>
+      <w:tr>
+        <w:tc>
+          <w:tcPr>
+            <w:tcW w:type="dxa" w:w="2160"/>
+          </w:tcPr>
+          <w:p>
+            <w:r>
+              <w:rPr>
+                <w:sz w:val="18"/>
+              </w:rPr>
+              <w:t>texto_extraido</w:t>
+            </w:r>
+          </w:p>
+        </w:tc>
+        <w:tc>
+          <w:tcPr>
+            <w:tcW w:type="dxa" w:w="2160"/>
+          </w:tcPr>
+          <w:p>
+            <w:r>
+              <w:rPr>
+                <w:sz w:val="18"/>
+              </w:rPr>
+              <w:t>text</w:t>
+            </w:r>
+          </w:p>
+        </w:tc>
+        <w:tc>
+          <w:tcPr>
+            <w:tcW w:type="dxa" w:w="2160"/>
+          </w:tcPr>
+          <w:p>
+            <w:r>
+              <w:rPr>
+                <w:sz w:val="18"/>
+              </w:rPr>
+              <w:t>No (default '')</w:t>
+            </w:r>
+          </w:p>
+        </w:tc>
+        <w:tc>
+          <w:tcPr>
+            <w:tcW w:type="dxa" w:w="2160"/>
+          </w:tcPr>
+          <w:p>
+            <w:r>
+              <w:rPr>
+                <w:sz w:val="18"/>
+              </w:rPr>
+              <w:t>Texto extraído del PDF por Document AI (OCR genérico). Vacío para imágenes o cuando la extracción está deshabilitada/falla (best-effort)</w:t>
             </w:r>
           </w:p>
         </w:tc>
@@ -15976,20 +16030,20 @@
               <w:rPr>
                 <w:sz w:val="18"/>
               </w:rPr>
-              <w:t>anio_academico</w:t>
-            </w:r>
-          </w:p>
-        </w:tc>
-        <w:tc>
-          <w:tcPr>
-            <w:tcW w:type="dxa" w:w="2160"/>
-          </w:tcPr>
-          <w:p>
-            <w:r>
-              <w:rPr>
-                <w:sz w:val="18"/>
-              </w:rPr>
-              <w:t>int</w:t>
+              <w:t>nota_promedio_ponderado</w:t>
+            </w:r>
+          </w:p>
+        </w:tc>
+        <w:tc>
+          <w:tcPr>
+            <w:tcW w:type="dxa" w:w="2160"/>
+          </w:tcPr>
+          <w:p>
+            <w:r>
+              <w:rPr>
+                <w:sz w:val="18"/>
+              </w:rPr>
+              <w:t>decimal(4,2)</w:t>
             </w:r>
           </w:p>
         </w:tc>
@@ -16015,223 +16069,7 @@
               <w:rPr>
                 <w:sz w:val="18"/>
               </w:rPr>
-              <w:t>Año académico</w:t>
-            </w:r>
-          </w:p>
-        </w:tc>
-      </w:tr>
-      <w:tr>
-        <w:tc>
-          <w:tcPr>
-            <w:tcW w:type="dxa" w:w="2160"/>
-          </w:tcPr>
-          <w:p>
-            <w:r>
-              <w:rPr>
-                <w:sz w:val="18"/>
-              </w:rPr>
-              <w:t>nota_promedio_ponderado</w:t>
-            </w:r>
-          </w:p>
-        </w:tc>
-        <w:tc>
-          <w:tcPr>
-            <w:tcW w:type="dxa" w:w="2160"/>
-          </w:tcPr>
-          <w:p>
-            <w:r>
-              <w:rPr>
-                <w:sz w:val="18"/>
-              </w:rPr>
-              <w:t>decimal(4,2)</w:t>
-            </w:r>
-          </w:p>
-        </w:tc>
-        <w:tc>
-          <w:tcPr>
-            <w:tcW w:type="dxa" w:w="2160"/>
-          </w:tcPr>
-          <w:p>
-            <w:r>
-              <w:rPr>
-                <w:sz w:val="18"/>
-              </w:rPr>
-              <w:t>Sí</w:t>
-            </w:r>
-          </w:p>
-        </w:tc>
-        <w:tc>
-          <w:tcPr>
-            <w:tcW w:type="dxa" w:w="2160"/>
-          </w:tcPr>
-          <w:p>
-            <w:r>
-              <w:rPr>
-                <w:sz w:val="18"/>
-              </w:rPr>
               <w:t>Nota promedio ponderado (escala 0–20)</w:t>
-            </w:r>
-          </w:p>
-        </w:tc>
-      </w:tr>
-      <w:tr>
-        <w:tc>
-          <w:tcPr>
-            <w:tcW w:type="dxa" w:w="2160"/>
-          </w:tcPr>
-          <w:p>
-            <w:r>
-              <w:rPr>
-                <w:sz w:val="18"/>
-              </w:rPr>
-              <w:t>contacto_emergencia_nombre</w:t>
-            </w:r>
-          </w:p>
-        </w:tc>
-        <w:tc>
-          <w:tcPr>
-            <w:tcW w:type="dxa" w:w="2160"/>
-          </w:tcPr>
-          <w:p>
-            <w:r>
-              <w:rPr>
-                <w:sz w:val="18"/>
-              </w:rPr>
-              <w:t>varchar(255)</w:t>
-            </w:r>
-          </w:p>
-        </w:tc>
-        <w:tc>
-          <w:tcPr>
-            <w:tcW w:type="dxa" w:w="2160"/>
-          </w:tcPr>
-          <w:p>
-            <w:r>
-              <w:rPr>
-                <w:sz w:val="18"/>
-              </w:rPr>
-              <w:t>Sí</w:t>
-            </w:r>
-          </w:p>
-        </w:tc>
-        <w:tc>
-          <w:tcPr>
-            <w:tcW w:type="dxa" w:w="2160"/>
-          </w:tcPr>
-          <w:p>
-            <w:r>
-              <w:rPr>
-                <w:sz w:val="18"/>
-              </w:rPr>
-              <w:t>Nombre del contacto de emergencia</w:t>
-            </w:r>
-          </w:p>
-        </w:tc>
-      </w:tr>
-      <w:tr>
-        <w:tc>
-          <w:tcPr>
-            <w:tcW w:type="dxa" w:w="2160"/>
-          </w:tcPr>
-          <w:p>
-            <w:r>
-              <w:rPr>
-                <w:sz w:val="18"/>
-              </w:rPr>
-              <w:t>contacto_emergencia_telefono</w:t>
-            </w:r>
-          </w:p>
-        </w:tc>
-        <w:tc>
-          <w:tcPr>
-            <w:tcW w:type="dxa" w:w="2160"/>
-          </w:tcPr>
-          <w:p>
-            <w:r>
-              <w:rPr>
-                <w:sz w:val="18"/>
-              </w:rPr>
-              <w:t>varchar(30)</w:t>
-            </w:r>
-          </w:p>
-        </w:tc>
-        <w:tc>
-          <w:tcPr>
-            <w:tcW w:type="dxa" w:w="2160"/>
-          </w:tcPr>
-          <w:p>
-            <w:r>
-              <w:rPr>
-                <w:sz w:val="18"/>
-              </w:rPr>
-              <w:t>Sí</w:t>
-            </w:r>
-          </w:p>
-        </w:tc>
-        <w:tc>
-          <w:tcPr>
-            <w:tcW w:type="dxa" w:w="2160"/>
-          </w:tcPr>
-          <w:p>
-            <w:r>
-              <w:rPr>
-                <w:sz w:val="18"/>
-              </w:rPr>
-              <w:t>Teléfono del contacto de emergencia</w:t>
-            </w:r>
-          </w:p>
-        </w:tc>
-      </w:tr>
-      <w:tr>
-        <w:tc>
-          <w:tcPr>
-            <w:tcW w:type="dxa" w:w="2160"/>
-          </w:tcPr>
-          <w:p>
-            <w:r>
-              <w:rPr>
-                <w:sz w:val="18"/>
-              </w:rPr>
-              <w:t>contacto_emergencia_parentesco_id</w:t>
-            </w:r>
-          </w:p>
-        </w:tc>
-        <w:tc>
-          <w:tcPr>
-            <w:tcW w:type="dxa" w:w="2160"/>
-          </w:tcPr>
-          <w:p>
-            <w:r>
-              <w:rPr>
-                <w:sz w:val="18"/>
-              </w:rPr>
-              <w:t>FK → parentesco</w:t>
-            </w:r>
-          </w:p>
-        </w:tc>
-        <w:tc>
-          <w:tcPr>
-            <w:tcW w:type="dxa" w:w="2160"/>
-          </w:tcPr>
-          <w:p>
-            <w:r>
-              <w:rPr>
-                <w:sz w:val="18"/>
-              </w:rPr>
-              <w:t>Sí</w:t>
-            </w:r>
-          </w:p>
-        </w:tc>
-        <w:tc>
-          <w:tcPr>
-            <w:tcW w:type="dxa" w:w="2160"/>
-          </w:tcPr>
-          <w:p>
-            <w:r>
-              <w:rPr>
-                <w:sz w:val="18"/>
-              </w:rPr>
-              <w:t>Parentesco del contacto de emergencia</w:t>
             </w:r>
           </w:p>
         </w:tc>
@@ -17253,6 +17091,255 @@
         <w:pStyle w:val="Heading3"/>
       </w:pPr>
       <w:r>
+        <w:t>tutor_universidad</w:t>
+      </w:r>
+    </w:p>
+    <w:tbl>
+      <w:tblPr>
+        <w:tblStyle w:val="LightGrid-Accent1"/>
+        <w:tblW w:type="auto" w:w="0"/>
+        <w:tblLook w:firstColumn="1" w:firstRow="1" w:lastColumn="0" w:lastRow="0" w:noHBand="0" w:noVBand="1" w:val="04A0"/>
+      </w:tblPr>
+      <w:tblGrid>
+        <w:gridCol w:w="2160"/>
+        <w:gridCol w:w="2160"/>
+        <w:gridCol w:w="2160"/>
+        <w:gridCol w:w="2160"/>
+      </w:tblGrid>
+      <w:tr>
+        <w:tc>
+          <w:tcPr>
+            <w:tcW w:type="dxa" w:w="2160"/>
+          </w:tcPr>
+          <w:p>
+            <w:r/>
+            <w:r>
+              <w:rPr>
+                <w:b/>
+                <w:color w:val="FFFFFF"/>
+                <w:sz w:val="18"/>
+              </w:rPr>
+              <w:t>Campo</w:t>
+            </w:r>
+          </w:p>
+        </w:tc>
+        <w:tc>
+          <w:tcPr>
+            <w:tcW w:type="dxa" w:w="2160"/>
+          </w:tcPr>
+          <w:p>
+            <w:r/>
+            <w:r>
+              <w:rPr>
+                <w:b/>
+                <w:color w:val="FFFFFF"/>
+                <w:sz w:val="18"/>
+              </w:rPr>
+              <w:t>Tipo</w:t>
+            </w:r>
+          </w:p>
+        </w:tc>
+        <w:tc>
+          <w:tcPr>
+            <w:tcW w:type="dxa" w:w="2160"/>
+          </w:tcPr>
+          <w:p>
+            <w:r/>
+            <w:r>
+              <w:rPr>
+                <w:b/>
+                <w:color w:val="FFFFFF"/>
+                <w:sz w:val="18"/>
+              </w:rPr>
+              <w:t>Nulo</w:t>
+            </w:r>
+          </w:p>
+        </w:tc>
+        <w:tc>
+          <w:tcPr>
+            <w:tcW w:type="dxa" w:w="2160"/>
+          </w:tcPr>
+          <w:p>
+            <w:r/>
+            <w:r>
+              <w:rPr>
+                <w:b/>
+                <w:color w:val="FFFFFF"/>
+                <w:sz w:val="18"/>
+              </w:rPr>
+              <w:t>Descripción</w:t>
+            </w:r>
+          </w:p>
+        </w:tc>
+      </w:tr>
+      <w:tr>
+        <w:tc>
+          <w:tcPr>
+            <w:tcW w:type="dxa" w:w="2160"/>
+          </w:tcPr>
+          <w:p>
+            <w:r>
+              <w:rPr>
+                <w:sz w:val="18"/>
+              </w:rPr>
+              <w:t>id</w:t>
+            </w:r>
+          </w:p>
+        </w:tc>
+        <w:tc>
+          <w:tcPr>
+            <w:tcW w:type="dxa" w:w="2160"/>
+          </w:tcPr>
+          <w:p>
+            <w:r>
+              <w:rPr>
+                <w:sz w:val="18"/>
+              </w:rPr>
+              <w:t>PK</w:t>
+            </w:r>
+          </w:p>
+        </w:tc>
+        <w:tc>
+          <w:tcPr>
+            <w:tcW w:type="dxa" w:w="2160"/>
+          </w:tcPr>
+          <w:p>
+            <w:r>
+              <w:rPr>
+                <w:sz w:val="18"/>
+              </w:rPr>
+              <w:t>No</w:t>
+            </w:r>
+          </w:p>
+        </w:tc>
+        <w:tc>
+          <w:tcPr>
+            <w:tcW w:type="dxa" w:w="2160"/>
+          </w:tcPr>
+          <w:p>
+            <w:r>
+              <w:rPr>
+                <w:sz w:val="18"/>
+              </w:rPr>
+            </w:r>
+          </w:p>
+        </w:tc>
+      </w:tr>
+      <w:tr>
+        <w:tc>
+          <w:tcPr>
+            <w:tcW w:type="dxa" w:w="2160"/>
+          </w:tcPr>
+          <w:p>
+            <w:r>
+              <w:rPr>
+                <w:sz w:val="18"/>
+              </w:rPr>
+              <w:t>tutor_id</w:t>
+            </w:r>
+          </w:p>
+        </w:tc>
+        <w:tc>
+          <w:tcPr>
+            <w:tcW w:type="dxa" w:w="2160"/>
+          </w:tcPr>
+          <w:p>
+            <w:r>
+              <w:rPr>
+                <w:sz w:val="18"/>
+              </w:rPr>
+              <w:t>FK → tutor</w:t>
+            </w:r>
+          </w:p>
+        </w:tc>
+        <w:tc>
+          <w:tcPr>
+            <w:tcW w:type="dxa" w:w="2160"/>
+          </w:tcPr>
+          <w:p>
+            <w:r>
+              <w:rPr>
+                <w:sz w:val="18"/>
+              </w:rPr>
+              <w:t>No</w:t>
+            </w:r>
+          </w:p>
+        </w:tc>
+        <w:tc>
+          <w:tcPr>
+            <w:tcW w:type="dxa" w:w="2160"/>
+          </w:tcPr>
+          <w:p>
+            <w:r>
+              <w:rPr>
+                <w:sz w:val="18"/>
+              </w:rPr>
+              <w:t>Tutor (CASCADE)</w:t>
+            </w:r>
+          </w:p>
+        </w:tc>
+      </w:tr>
+      <w:tr>
+        <w:tc>
+          <w:tcPr>
+            <w:tcW w:type="dxa" w:w="2160"/>
+          </w:tcPr>
+          <w:p>
+            <w:r>
+              <w:rPr>
+                <w:sz w:val="18"/>
+              </w:rPr>
+              <w:t>universidad_id</w:t>
+            </w:r>
+          </w:p>
+        </w:tc>
+        <w:tc>
+          <w:tcPr>
+            <w:tcW w:type="dxa" w:w="2160"/>
+          </w:tcPr>
+          <w:p>
+            <w:r>
+              <w:rPr>
+                <w:sz w:val="18"/>
+              </w:rPr>
+              <w:t>FK → universidad</w:t>
+            </w:r>
+          </w:p>
+        </w:tc>
+        <w:tc>
+          <w:tcPr>
+            <w:tcW w:type="dxa" w:w="2160"/>
+          </w:tcPr>
+          <w:p>
+            <w:r>
+              <w:rPr>
+                <w:sz w:val="18"/>
+              </w:rPr>
+              <w:t>No</w:t>
+            </w:r>
+          </w:p>
+        </w:tc>
+        <w:tc>
+          <w:tcPr>
+            <w:tcW w:type="dxa" w:w="2160"/>
+          </w:tcPr>
+          <w:p>
+            <w:r>
+              <w:rPr>
+                <w:sz w:val="18"/>
+              </w:rPr>
+              <w:t>Universidad (PROTECT)</w:t>
+            </w:r>
+          </w:p>
+        </w:tc>
+      </w:tr>
+    </w:tbl>
+    <w:p/>
+    <w:p>
+      <w:pPr>
+        <w:pStyle w:val="Heading3"/>
+      </w:pPr>
+      <w:r>
         <w:t>interno</w:t>
       </w:r>
     </w:p>
@@ -17815,6 +17902,168 @@
                 <w:sz w:val="18"/>
               </w:rPr>
               <w:t>Estado de las declaraciones juradas del interno (RN-23). Valores: PENDIENTE (default), COMPLETAS, OBSERVADAS, VALIDADAS</w:t>
+            </w:r>
+          </w:p>
+        </w:tc>
+      </w:tr>
+      <w:tr>
+        <w:tc>
+          <w:tcPr>
+            <w:tcW w:type="dxa" w:w="2160"/>
+          </w:tcPr>
+          <w:p>
+            <w:r>
+              <w:rPr>
+                <w:sz w:val="18"/>
+              </w:rPr>
+              <w:t>contacto_emergencia_nombre</w:t>
+            </w:r>
+          </w:p>
+        </w:tc>
+        <w:tc>
+          <w:tcPr>
+            <w:tcW w:type="dxa" w:w="2160"/>
+          </w:tcPr>
+          <w:p>
+            <w:r>
+              <w:rPr>
+                <w:sz w:val="18"/>
+              </w:rPr>
+              <w:t>varchar(255)</w:t>
+            </w:r>
+          </w:p>
+        </w:tc>
+        <w:tc>
+          <w:tcPr>
+            <w:tcW w:type="dxa" w:w="2160"/>
+          </w:tcPr>
+          <w:p>
+            <w:r>
+              <w:rPr>
+                <w:sz w:val="18"/>
+              </w:rPr>
+              <w:t>Sí</w:t>
+            </w:r>
+          </w:p>
+        </w:tc>
+        <w:tc>
+          <w:tcPr>
+            <w:tcW w:type="dxa" w:w="2160"/>
+          </w:tcPr>
+          <w:p>
+            <w:r>
+              <w:rPr>
+                <w:sz w:val="18"/>
+              </w:rPr>
+              <w:t>Nombre del contacto de emergencia</w:t>
+            </w:r>
+          </w:p>
+        </w:tc>
+      </w:tr>
+      <w:tr>
+        <w:tc>
+          <w:tcPr>
+            <w:tcW w:type="dxa" w:w="2160"/>
+          </w:tcPr>
+          <w:p>
+            <w:r>
+              <w:rPr>
+                <w:sz w:val="18"/>
+              </w:rPr>
+              <w:t>contacto_emergencia_telefono</w:t>
+            </w:r>
+          </w:p>
+        </w:tc>
+        <w:tc>
+          <w:tcPr>
+            <w:tcW w:type="dxa" w:w="2160"/>
+          </w:tcPr>
+          <w:p>
+            <w:r>
+              <w:rPr>
+                <w:sz w:val="18"/>
+              </w:rPr>
+              <w:t>varchar(30)</w:t>
+            </w:r>
+          </w:p>
+        </w:tc>
+        <w:tc>
+          <w:tcPr>
+            <w:tcW w:type="dxa" w:w="2160"/>
+          </w:tcPr>
+          <w:p>
+            <w:r>
+              <w:rPr>
+                <w:sz w:val="18"/>
+              </w:rPr>
+              <w:t>Sí</w:t>
+            </w:r>
+          </w:p>
+        </w:tc>
+        <w:tc>
+          <w:tcPr>
+            <w:tcW w:type="dxa" w:w="2160"/>
+          </w:tcPr>
+          <w:p>
+            <w:r>
+              <w:rPr>
+                <w:sz w:val="18"/>
+              </w:rPr>
+              <w:t>Teléfono del contacto de emergencia</w:t>
+            </w:r>
+          </w:p>
+        </w:tc>
+      </w:tr>
+      <w:tr>
+        <w:tc>
+          <w:tcPr>
+            <w:tcW w:type="dxa" w:w="2160"/>
+          </w:tcPr>
+          <w:p>
+            <w:r>
+              <w:rPr>
+                <w:sz w:val="18"/>
+              </w:rPr>
+              <w:t>contacto_emergencia_parentesco_id</w:t>
+            </w:r>
+          </w:p>
+        </w:tc>
+        <w:tc>
+          <w:tcPr>
+            <w:tcW w:type="dxa" w:w="2160"/>
+          </w:tcPr>
+          <w:p>
+            <w:r>
+              <w:rPr>
+                <w:sz w:val="18"/>
+              </w:rPr>
+              <w:t>FK → parentesco</w:t>
+            </w:r>
+          </w:p>
+        </w:tc>
+        <w:tc>
+          <w:tcPr>
+            <w:tcW w:type="dxa" w:w="2160"/>
+          </w:tcPr>
+          <w:p>
+            <w:r>
+              <w:rPr>
+                <w:sz w:val="18"/>
+              </w:rPr>
+              <w:t>Sí</w:t>
+            </w:r>
+          </w:p>
+        </w:tc>
+        <w:tc>
+          <w:tcPr>
+            <w:tcW w:type="dxa" w:w="2160"/>
+          </w:tcPr>
+          <w:p>
+            <w:r>
+              <w:rPr>
+                <w:sz w:val="18"/>
+              </w:rPr>
+              <w:t>Parentesco del contacto de emergencia (PROTECT)</w:t>
             </w:r>
           </w:p>
         </w:tc>
@@ -20690,11 +20939,13 @@
           <w:rFonts w:ascii="Consolas" w:hAnsi="Consolas"/>
           <w:sz w:val="16"/>
         </w:rPr>
-        <w:t>estudiante &gt;── universidad / carrera_profesional / tipo_documento_identidad / parentesco (contacto_emergencia_parentesco_id)</w:t>
+        <w:t>estudiante &gt;── universidad / carrera_profesional / tipo_documento_identidad</w:t>
         <w:br/>
         <w:t>estudiante &gt;── periodo_academico / especialidad   (uno u otro según nivel — RN-19)</w:t>
         <w:br/>
         <w:t>tutor   &gt;── especialidad / ipress / tipo_documento_identidad</w:t>
+        <w:br/>
+        <w:t>tutor   ──&lt; tutor_universidad &gt;── universidad   (1 a 2 universidades — RN-24)</w:t>
         <w:br/>
         <w:br/>
         <w:t>interno &gt;── estudiante</w:t>
@@ -20706,6 +20957,8 @@
         <w:t>interno &gt;── ipress (sede principal)</w:t>
         <w:br/>
         <w:t>interno &gt;── tutor</w:t>
+        <w:br/>
+        <w:t>interno &gt;── parentesco (contacto_emergencia_parentesco_id)</w:t>
         <w:br/>
         <w:t>interno &gt;── ambito_geografico_sanitario</w:t>
         <w:br/>
@@ -22908,9 +23161,13 @@
         <w:br/>
         <w:t xml:space="preserve">    universidad ||--o{ estudiante : ""</w:t>
         <w:br/>
+        <w:t xml:space="preserve">    universidad ||--o{ tutor_universidad : ""</w:t>
+        <w:br/>
+        <w:t xml:space="preserve">    tutor ||--o{ tutor_universidad : "1 a 2 (RN-24)"</w:t>
+        <w:br/>
         <w:t xml:space="preserve">    carrera_profesional ||--o{ estudiante : ""</w:t>
         <w:br/>
-        <w:t xml:space="preserve">    parentesco ||--o{ estudiante : "contacto emergencia"</w:t>
+        <w:t xml:space="preserve">    parentesco ||--o{ interno : "contacto emergencia"</w:t>
         <w:br/>
         <w:t xml:space="preserve">    periodo_academico ||--o{ estudiante : "Pregrado (RN-19)"</w:t>
         <w:br/>
@@ -23507,7 +23764,7 @@
               <w:rPr>
                 <w:sz w:val="18"/>
               </w:rPr>
-              <w:t>estado_internado, estado_rotacion, servicio_area, tipo_documento_identidad, parentesco, periodo_academico, documentos_anexos, estudiante, tutor, interno, historial_estado_internado, historial_tutor, rotacion, autorizacion_rotacion, historial_estado_rotacion</w:t>
+              <w:t>estado_internado, estado_rotacion, servicio_area, tipo_documento_identidad, parentesco, periodo_academico, documentos_anexos, estudiante, tutor, tutor_universidad, interno, historial_estado_internado, historial_tutor, rotacion, autorizacion_rotacion, historial_estado_rotacion</w:t>
             </w:r>
           </w:p>
         </w:tc>

</xml_diff>